<commit_message>
Harden tutorial QA guidance
Co-authored-by: Copilot App <223556219+Copilot@users.noreply.github.com>
</commit_message>
<xml_diff>
--- a/CesiumJS_101_ISS_Tracker_Tutorial.docx
+++ b/CesiumJS_101_ISS_Tracker_Tutorial.docx
@@ -7055,6 +7055,24 @@
         <w:t xml:space="preserve">You must be logged in to Sketchfab. The button appears on the right side of the model page once signed in.</w:t>
       </w:r>
     </w:p>
+    <w:p>
+      <w:pPr>
+        <w:pStyle w:val="BlockText"/>
+      </w:pPr>
+      <w:r>
+        <w:rPr>
+          <w:b/>
+          <w:bCs/>
+        </w:rPr>
+        <w:t xml:space="preserve">Automation note:</w:t>
+      </w:r>
+      <w:r>
+        <w:t xml:space="preserve"> </w:t>
+      </w:r>
+      <w:r>
+        <w:t xml:space="preserve">Sketchfab can show anti-bot/CAPTCHA checks in automated environments. If that happens, complete this download manually in your normal browser session.</w:t>
+      </w:r>
+    </w:p>
     <w:bookmarkEnd w:id="15"/>
     <w:bookmarkStart w:id="16" w:name="step-7b-upload-to-cesium-ion"/>
     <w:p>
@@ -7195,6 +7213,39 @@
         <w:t xml:space="preserve">)</w:t>
       </w:r>
     </w:p>
+    <w:p>
+      <w:pPr>
+        <w:pStyle w:val="BlockText"/>
+      </w:pPr>
+      <w:r>
+        <w:rPr>
+          <w:b/>
+          <w:bCs/>
+        </w:rPr>
+        <w:t xml:space="preserve">If Sketchfab download is temporarily blocked:</w:t>
+      </w:r>
+      <w:r>
+        <w:t xml:space="preserve"> </w:t>
+      </w:r>
+      <w:r>
+        <w:t xml:space="preserve">You can still validate all downstream Cesium ion upload + app wiring steps with any local glTF model folder (a</w:t>
+      </w:r>
+      <w:r>
+        <w:t xml:space="preserve"> </w:t>
+      </w:r>
+      <w:r>
+        <w:rPr>
+          <w:rStyle w:val="VerbatimChar"/>
+        </w:rPr>
+        <w:t xml:space="preserve">.gltf</w:t>
+      </w:r>
+      <w:r>
+        <w:t xml:space="preserve"> </w:t>
+      </w:r>
+      <w:r>
+        <w:t xml:space="preserve">plus its textures/buffers). Then swap to the ISS model once Sketchfab access works.</w:t>
+      </w:r>
+    </w:p>
     <w:bookmarkEnd w:id="16"/>
     <w:bookmarkStart w:id="17" w:name="step-7c-wire-it-into-the-app"/>
     <w:p>
@@ -9153,6 +9204,255 @@
         <w:rPr>
           <w:rStyle w:val="KeywordTok"/>
         </w:rPr>
+        <w:t xml:space="preserve">let</w:t>
+      </w:r>
+      <w:r>
+        <w:rPr>
+          <w:rStyle w:val="NormalTok"/>
+        </w:rPr>
+        <w:t xml:space="preserve"> issModelUri</w:t>
+      </w:r>
+      <w:r>
+        <w:rPr>
+          <w:rStyle w:val="OperatorTok"/>
+        </w:rPr>
+        <w:t xml:space="preserve">;</w:t>
+      </w:r>
+      <w:r>
+        <w:br/>
+      </w:r>
+      <w:r>
+        <w:rPr>
+          <w:rStyle w:val="ControlFlowTok"/>
+        </w:rPr>
+        <w:t xml:space="preserve">try</w:t>
+      </w:r>
+      <w:r>
+        <w:rPr>
+          <w:rStyle w:val="NormalTok"/>
+        </w:rPr>
+        <w:t xml:space="preserve"> {</w:t>
+      </w:r>
+      <w:r>
+        <w:br/>
+      </w:r>
+      <w:r>
+        <w:rPr>
+          <w:rStyle w:val="NormalTok"/>
+        </w:rPr>
+        <w:t xml:space="preserve">  issModelUri </w:t>
+      </w:r>
+      <w:r>
+        <w:rPr>
+          <w:rStyle w:val="OperatorTok"/>
+        </w:rPr>
+        <w:t xml:space="preserve">=</w:t>
+      </w:r>
+      <w:r>
+        <w:rPr>
+          <w:rStyle w:val="NormalTok"/>
+        </w:rPr>
+        <w:t xml:space="preserve"> </w:t>
+      </w:r>
+      <w:r>
+        <w:rPr>
+          <w:rStyle w:val="ControlFlowTok"/>
+        </w:rPr>
+        <w:t xml:space="preserve">await</w:t>
+      </w:r>
+      <w:r>
+        <w:rPr>
+          <w:rStyle w:val="NormalTok"/>
+        </w:rPr>
+        <w:t xml:space="preserve"> IonResource</w:t>
+      </w:r>
+      <w:r>
+        <w:rPr>
+          <w:rStyle w:val="OperatorTok"/>
+        </w:rPr>
+        <w:t xml:space="preserve">.</w:t>
+      </w:r>
+      <w:r>
+        <w:rPr>
+          <w:rStyle w:val="FunctionTok"/>
+        </w:rPr>
+        <w:t xml:space="preserve">fromAssetId</w:t>
+      </w:r>
+      <w:r>
+        <w:rPr>
+          <w:rStyle w:val="NormalTok"/>
+        </w:rPr>
+        <w:t xml:space="preserve">(ISS_ION_ASSET_ID)</w:t>
+      </w:r>
+      <w:r>
+        <w:rPr>
+          <w:rStyle w:val="OperatorTok"/>
+        </w:rPr>
+        <w:t xml:space="preserve">;</w:t>
+      </w:r>
+      <w:r>
+        <w:br/>
+      </w:r>
+      <w:r>
+        <w:rPr>
+          <w:rStyle w:val="NormalTok"/>
+        </w:rPr>
+        <w:t xml:space="preserve">} </w:t>
+      </w:r>
+      <w:r>
+        <w:rPr>
+          <w:rStyle w:val="ControlFlowTok"/>
+        </w:rPr>
+        <w:t xml:space="preserve">catch</w:t>
+      </w:r>
+      <w:r>
+        <w:rPr>
+          <w:rStyle w:val="NormalTok"/>
+        </w:rPr>
+        <w:t xml:space="preserve"> (error) {</w:t>
+      </w:r>
+      <w:r>
+        <w:br/>
+      </w:r>
+      <w:r>
+        <w:rPr>
+          <w:rStyle w:val="NormalTok"/>
+        </w:rPr>
+        <w:t xml:space="preserve">  </w:t>
+      </w:r>
+      <w:r>
+        <w:rPr>
+          <w:rStyle w:val="ControlFlowTok"/>
+        </w:rPr>
+        <w:t xml:space="preserve">throw</w:t>
+      </w:r>
+      <w:r>
+        <w:rPr>
+          <w:rStyle w:val="NormalTok"/>
+        </w:rPr>
+        <w:t xml:space="preserve"> </w:t>
+      </w:r>
+      <w:r>
+        <w:rPr>
+          <w:rStyle w:val="KeywordTok"/>
+        </w:rPr>
+        <w:t xml:space="preserve">new</w:t>
+      </w:r>
+      <w:r>
+        <w:rPr>
+          <w:rStyle w:val="NormalTok"/>
+        </w:rPr>
+        <w:t xml:space="preserve"> </w:t>
+      </w:r>
+      <w:r>
+        <w:rPr>
+          <w:rStyle w:val="BuiltInTok"/>
+        </w:rPr>
+        <w:t xml:space="preserve">Error</w:t>
+      </w:r>
+      <w:r>
+        <w:rPr>
+          <w:rStyle w:val="NormalTok"/>
+        </w:rPr>
+        <w:t xml:space="preserve">(</w:t>
+      </w:r>
+      <w:r>
+        <w:br/>
+      </w:r>
+      <w:r>
+        <w:rPr>
+          <w:rStyle w:val="NormalTok"/>
+        </w:rPr>
+        <w:t xml:space="preserve">    </w:t>
+      </w:r>
+      <w:r>
+        <w:rPr>
+          <w:rStyle w:val="VerbatimStringTok"/>
+        </w:rPr>
+        <w:t xml:space="preserve">`Failed to load ion model asset </w:t>
+      </w:r>
+      <w:r>
+        <w:rPr>
+          <w:rStyle w:val="SpecialCharTok"/>
+        </w:rPr>
+        <w:t xml:space="preserve">${</w:t>
+      </w:r>
+      <w:r>
+        <w:rPr>
+          <w:rStyle w:val="NormalTok"/>
+        </w:rPr>
+        <w:t xml:space="preserve">ISS_ION_ASSET_ID</w:t>
+      </w:r>
+      <w:r>
+        <w:rPr>
+          <w:rStyle w:val="SpecialCharTok"/>
+        </w:rPr>
+        <w:t xml:space="preserve">}</w:t>
+      </w:r>
+      <w:r>
+        <w:rPr>
+          <w:rStyle w:val="VerbatimStringTok"/>
+        </w:rPr>
+        <w:t xml:space="preserve">. Verify the asset ID, token scope, and that processing finished. Original error: </w:t>
+      </w:r>
+      <w:r>
+        <w:rPr>
+          <w:rStyle w:val="SpecialCharTok"/>
+        </w:rPr>
+        <w:t xml:space="preserve">${</w:t>
+      </w:r>
+      <w:r>
+        <w:rPr>
+          <w:rStyle w:val="NormalTok"/>
+        </w:rPr>
+        <w:t xml:space="preserve">error</w:t>
+      </w:r>
+      <w:r>
+        <w:rPr>
+          <w:rStyle w:val="SpecialCharTok"/>
+        </w:rPr>
+        <w:t xml:space="preserve">}</w:t>
+      </w:r>
+      <w:r>
+        <w:rPr>
+          <w:rStyle w:val="VerbatimStringTok"/>
+        </w:rPr>
+        <w:t xml:space="preserve">`</w:t>
+      </w:r>
+      <w:r>
+        <w:br/>
+      </w:r>
+      <w:r>
+        <w:rPr>
+          <w:rStyle w:val="NormalTok"/>
+        </w:rPr>
+        <w:t xml:space="preserve">  )</w:t>
+      </w:r>
+      <w:r>
+        <w:rPr>
+          <w:rStyle w:val="OperatorTok"/>
+        </w:rPr>
+        <w:t xml:space="preserve">;</w:t>
+      </w:r>
+      <w:r>
+        <w:br/>
+      </w:r>
+      <w:r>
+        <w:rPr>
+          <w:rStyle w:val="NormalTok"/>
+        </w:rPr>
+        <w:t xml:space="preserve">}</w:t>
+      </w:r>
+      <w:r>
+        <w:br/>
+      </w:r>
+      <w:r>
+        <w:br/>
+      </w:r>
+      <w:r>
+        <w:rPr>
+          <w:rStyle w:val="KeywordTok"/>
+        </w:rPr>
         <w:t xml:space="preserve">const</w:t>
       </w:r>
       <w:r>
@@ -9429,19 +9729,607 @@
         <w:rPr>
           <w:rStyle w:val="NormalTok"/>
         </w:rPr>
-        <w:t xml:space="preserve"> </w:t>
+        <w:t xml:space="preserve"> issModelUri</w:t>
+      </w:r>
+      <w:r>
+        <w:rPr>
+          <w:rStyle w:val="OperatorTok"/>
+        </w:rPr>
+        <w:t xml:space="preserve">,</w:t>
+      </w:r>
+      <w:r>
+        <w:br/>
+      </w:r>
+      <w:r>
+        <w:rPr>
+          <w:rStyle w:val="NormalTok"/>
+        </w:rPr>
+        <w:t xml:space="preserve">    </w:t>
+      </w:r>
+      <w:r>
+        <w:rPr>
+          <w:rStyle w:val="DataTypeTok"/>
+        </w:rPr>
+        <w:t xml:space="preserve">minimumPixelSize</w:t>
+      </w:r>
+      <w:r>
+        <w:rPr>
+          <w:rStyle w:val="OperatorTok"/>
+        </w:rPr>
+        <w:t xml:space="preserve">:</w:t>
+      </w:r>
+      <w:r>
+        <w:rPr>
+          <w:rStyle w:val="NormalTok"/>
+        </w:rPr>
+        <w:t xml:space="preserve"> </w:t>
+      </w:r>
+      <w:r>
+        <w:rPr>
+          <w:rStyle w:val="DecValTok"/>
+        </w:rPr>
+        <w:t xml:space="preserve">64</w:t>
+      </w:r>
+      <w:r>
+        <w:rPr>
+          <w:rStyle w:val="OperatorTok"/>
+        </w:rPr>
+        <w:t xml:space="preserve">,</w:t>
+      </w:r>
+      <w:r>
+        <w:br/>
+      </w:r>
+      <w:r>
+        <w:rPr>
+          <w:rStyle w:val="NormalTok"/>
+        </w:rPr>
+        <w:t xml:space="preserve">    </w:t>
+      </w:r>
+      <w:r>
+        <w:rPr>
+          <w:rStyle w:val="DataTypeTok"/>
+        </w:rPr>
+        <w:t xml:space="preserve">maximumScale</w:t>
+      </w:r>
+      <w:r>
+        <w:rPr>
+          <w:rStyle w:val="OperatorTok"/>
+        </w:rPr>
+        <w:t xml:space="preserve">:</w:t>
+      </w:r>
+      <w:r>
+        <w:rPr>
+          <w:rStyle w:val="NormalTok"/>
+        </w:rPr>
+        <w:t xml:space="preserve"> </w:t>
+      </w:r>
+      <w:r>
+        <w:rPr>
+          <w:rStyle w:val="FloatTok"/>
+        </w:rPr>
+        <w:t xml:space="preserve">20_000.0</w:t>
+      </w:r>
+      <w:r>
+        <w:rPr>
+          <w:rStyle w:val="OperatorTok"/>
+        </w:rPr>
+        <w:t xml:space="preserve">,</w:t>
+      </w:r>
+      <w:r>
+        <w:br/>
+      </w:r>
+      <w:r>
+        <w:rPr>
+          <w:rStyle w:val="NormalTok"/>
+        </w:rPr>
+        <w:t xml:space="preserve">  }</w:t>
+      </w:r>
+      <w:r>
+        <w:rPr>
+          <w:rStyle w:val="OperatorTok"/>
+        </w:rPr>
+        <w:t xml:space="preserve">,</w:t>
+      </w:r>
+      <w:r>
+        <w:br/>
+      </w:r>
+      <w:r>
+        <w:rPr>
+          <w:rStyle w:val="NormalTok"/>
+        </w:rPr>
+        <w:t xml:space="preserve">  </w:t>
+      </w:r>
+      <w:r>
+        <w:rPr>
+          <w:rStyle w:val="DataTypeTok"/>
+        </w:rPr>
+        <w:t xml:space="preserve">path</w:t>
+      </w:r>
+      <w:r>
+        <w:rPr>
+          <w:rStyle w:val="OperatorTok"/>
+        </w:rPr>
+        <w:t xml:space="preserve">:</w:t>
+      </w:r>
+      <w:r>
+        <w:rPr>
+          <w:rStyle w:val="NormalTok"/>
+        </w:rPr>
+        <w:t xml:space="preserve"> {</w:t>
+      </w:r>
+      <w:r>
+        <w:br/>
+      </w:r>
+      <w:r>
+        <w:rPr>
+          <w:rStyle w:val="NormalTok"/>
+        </w:rPr>
+        <w:t xml:space="preserve">    </w:t>
+      </w:r>
+      <w:r>
+        <w:rPr>
+          <w:rStyle w:val="DataTypeTok"/>
+        </w:rPr>
+        <w:t xml:space="preserve">resolution</w:t>
+      </w:r>
+      <w:r>
+        <w:rPr>
+          <w:rStyle w:val="OperatorTok"/>
+        </w:rPr>
+        <w:t xml:space="preserve">:</w:t>
+      </w:r>
+      <w:r>
+        <w:rPr>
+          <w:rStyle w:val="NormalTok"/>
+        </w:rPr>
+        <w:t xml:space="preserve"> </w:t>
+      </w:r>
+      <w:r>
+        <w:rPr>
+          <w:rStyle w:val="DecValTok"/>
+        </w:rPr>
+        <w:t xml:space="preserve">120</w:t>
+      </w:r>
+      <w:r>
+        <w:rPr>
+          <w:rStyle w:val="OperatorTok"/>
+        </w:rPr>
+        <w:t xml:space="preserve">,</w:t>
+      </w:r>
+      <w:r>
+        <w:br/>
+      </w:r>
+      <w:r>
+        <w:rPr>
+          <w:rStyle w:val="NormalTok"/>
+        </w:rPr>
+        <w:t xml:space="preserve">    </w:t>
+      </w:r>
+      <w:r>
+        <w:rPr>
+          <w:rStyle w:val="DataTypeTok"/>
+        </w:rPr>
+        <w:t xml:space="preserve">material</w:t>
+      </w:r>
+      <w:r>
+        <w:rPr>
+          <w:rStyle w:val="OperatorTok"/>
+        </w:rPr>
+        <w:t xml:space="preserve">:</w:t>
+      </w:r>
+      <w:r>
+        <w:rPr>
+          <w:rStyle w:val="NormalTok"/>
+        </w:rPr>
+        <w:t xml:space="preserve"> </w:t>
+      </w:r>
+      <w:r>
+        <w:rPr>
+          <w:rStyle w:val="KeywordTok"/>
+        </w:rPr>
+        <w:t xml:space="preserve">new</w:t>
+      </w:r>
+      <w:r>
+        <w:rPr>
+          <w:rStyle w:val="NormalTok"/>
+        </w:rPr>
+        <w:t xml:space="preserve"> </w:t>
+      </w:r>
+      <w:r>
+        <w:rPr>
+          <w:rStyle w:val="FunctionTok"/>
+        </w:rPr>
+        <w:t xml:space="preserve">PolylineGlowMaterialProperty</w:t>
+      </w:r>
+      <w:r>
+        <w:rPr>
+          <w:rStyle w:val="NormalTok"/>
+        </w:rPr>
+        <w:t xml:space="preserve">({</w:t>
+      </w:r>
+      <w:r>
+        <w:br/>
+      </w:r>
+      <w:r>
+        <w:rPr>
+          <w:rStyle w:val="NormalTok"/>
+        </w:rPr>
+        <w:t xml:space="preserve">      </w:t>
+      </w:r>
+      <w:r>
+        <w:rPr>
+          <w:rStyle w:val="DataTypeTok"/>
+        </w:rPr>
+        <w:t xml:space="preserve">glowPower</w:t>
+      </w:r>
+      <w:r>
+        <w:rPr>
+          <w:rStyle w:val="OperatorTok"/>
+        </w:rPr>
+        <w:t xml:space="preserve">:</w:t>
+      </w:r>
+      <w:r>
+        <w:rPr>
+          <w:rStyle w:val="NormalTok"/>
+        </w:rPr>
+        <w:t xml:space="preserve"> </w:t>
+      </w:r>
+      <w:r>
+        <w:rPr>
+          <w:rStyle w:val="FloatTok"/>
+        </w:rPr>
+        <w:t xml:space="preserve">0.2</w:t>
+      </w:r>
+      <w:r>
+        <w:rPr>
+          <w:rStyle w:val="OperatorTok"/>
+        </w:rPr>
+        <w:t xml:space="preserve">,</w:t>
+      </w:r>
+      <w:r>
+        <w:br/>
+      </w:r>
+      <w:r>
+        <w:rPr>
+          <w:rStyle w:val="NormalTok"/>
+        </w:rPr>
+        <w:t xml:space="preserve">      </w:t>
+      </w:r>
+      <w:r>
+        <w:rPr>
+          <w:rStyle w:val="DataTypeTok"/>
+        </w:rPr>
+        <w:t xml:space="preserve">color</w:t>
+      </w:r>
+      <w:r>
+        <w:rPr>
+          <w:rStyle w:val="OperatorTok"/>
+        </w:rPr>
+        <w:t xml:space="preserve">:</w:t>
+      </w:r>
+      <w:r>
+        <w:rPr>
+          <w:rStyle w:val="NormalTok"/>
+        </w:rPr>
+        <w:t xml:space="preserve"> Color</w:t>
+      </w:r>
+      <w:r>
+        <w:rPr>
+          <w:rStyle w:val="OperatorTok"/>
+        </w:rPr>
+        <w:t xml:space="preserve">.</w:t>
+      </w:r>
+      <w:r>
+        <w:rPr>
+          <w:rStyle w:val="AttributeTok"/>
+        </w:rPr>
+        <w:t xml:space="preserve">CYAN</w:t>
+      </w:r>
+      <w:r>
+        <w:rPr>
+          <w:rStyle w:val="OperatorTok"/>
+        </w:rPr>
+        <w:t xml:space="preserve">,</w:t>
+      </w:r>
+      <w:r>
+        <w:br/>
+      </w:r>
+      <w:r>
+        <w:rPr>
+          <w:rStyle w:val="NormalTok"/>
+        </w:rPr>
+        <w:t xml:space="preserve">    })</w:t>
+      </w:r>
+      <w:r>
+        <w:rPr>
+          <w:rStyle w:val="OperatorTok"/>
+        </w:rPr>
+        <w:t xml:space="preserve">,</w:t>
+      </w:r>
+      <w:r>
+        <w:br/>
+      </w:r>
+      <w:r>
+        <w:rPr>
+          <w:rStyle w:val="NormalTok"/>
+        </w:rPr>
+        <w:t xml:space="preserve">    </w:t>
+      </w:r>
+      <w:r>
+        <w:rPr>
+          <w:rStyle w:val="DataTypeTok"/>
+        </w:rPr>
+        <w:t xml:space="preserve">width</w:t>
+      </w:r>
+      <w:r>
+        <w:rPr>
+          <w:rStyle w:val="OperatorTok"/>
+        </w:rPr>
+        <w:t xml:space="preserve">:</w:t>
+      </w:r>
+      <w:r>
+        <w:rPr>
+          <w:rStyle w:val="NormalTok"/>
+        </w:rPr>
+        <w:t xml:space="preserve"> </w:t>
+      </w:r>
+      <w:r>
+        <w:rPr>
+          <w:rStyle w:val="DecValTok"/>
+        </w:rPr>
+        <w:t xml:space="preserve">8</w:t>
+      </w:r>
+      <w:r>
+        <w:rPr>
+          <w:rStyle w:val="OperatorTok"/>
+        </w:rPr>
+        <w:t xml:space="preserve">,</w:t>
+      </w:r>
+      <w:r>
+        <w:br/>
+      </w:r>
+      <w:r>
+        <w:rPr>
+          <w:rStyle w:val="NormalTok"/>
+        </w:rPr>
+        <w:t xml:space="preserve">    </w:t>
+      </w:r>
+      <w:r>
+        <w:rPr>
+          <w:rStyle w:val="DataTypeTok"/>
+        </w:rPr>
+        <w:t xml:space="preserve">leadTime</w:t>
+      </w:r>
+      <w:r>
+        <w:rPr>
+          <w:rStyle w:val="OperatorTok"/>
+        </w:rPr>
+        <w:t xml:space="preserve">:</w:t>
+      </w:r>
+      <w:r>
+        <w:rPr>
+          <w:rStyle w:val="NormalTok"/>
+        </w:rPr>
+        <w:t xml:space="preserve"> </w:t>
+      </w:r>
+      <w:r>
+        <w:rPr>
+          <w:rStyle w:val="DecValTok"/>
+        </w:rPr>
+        <w:t xml:space="preserve">93</w:t>
+      </w:r>
+      <w:r>
+        <w:rPr>
+          <w:rStyle w:val="NormalTok"/>
+        </w:rPr>
+        <w:t xml:space="preserve"> </w:t>
+      </w:r>
+      <w:r>
+        <w:rPr>
+          <w:rStyle w:val="OperatorTok"/>
+        </w:rPr>
+        <w:t xml:space="preserve">*</w:t>
+      </w:r>
+      <w:r>
+        <w:rPr>
+          <w:rStyle w:val="NormalTok"/>
+        </w:rPr>
+        <w:t xml:space="preserve"> </w:t>
+      </w:r>
+      <w:r>
+        <w:rPr>
+          <w:rStyle w:val="DecValTok"/>
+        </w:rPr>
+        <w:t xml:space="preserve">60</w:t>
+      </w:r>
+      <w:r>
+        <w:rPr>
+          <w:rStyle w:val="OperatorTok"/>
+        </w:rPr>
+        <w:t xml:space="preserve">,</w:t>
+      </w:r>
+      <w:r>
+        <w:br/>
+      </w:r>
+      <w:r>
+        <w:rPr>
+          <w:rStyle w:val="NormalTok"/>
+        </w:rPr>
+        <w:t xml:space="preserve">    </w:t>
+      </w:r>
+      <w:r>
+        <w:rPr>
+          <w:rStyle w:val="DataTypeTok"/>
+        </w:rPr>
+        <w:t xml:space="preserve">trailTime</w:t>
+      </w:r>
+      <w:r>
+        <w:rPr>
+          <w:rStyle w:val="OperatorTok"/>
+        </w:rPr>
+        <w:t xml:space="preserve">:</w:t>
+      </w:r>
+      <w:r>
+        <w:rPr>
+          <w:rStyle w:val="NormalTok"/>
+        </w:rPr>
+        <w:t xml:space="preserve"> </w:t>
+      </w:r>
+      <w:r>
+        <w:rPr>
+          <w:rStyle w:val="DecValTok"/>
+        </w:rPr>
+        <w:t xml:space="preserve">93</w:t>
+      </w:r>
+      <w:r>
+        <w:rPr>
+          <w:rStyle w:val="NormalTok"/>
+        </w:rPr>
+        <w:t xml:space="preserve"> </w:t>
+      </w:r>
+      <w:r>
+        <w:rPr>
+          <w:rStyle w:val="OperatorTok"/>
+        </w:rPr>
+        <w:t xml:space="preserve">*</w:t>
+      </w:r>
+      <w:r>
+        <w:rPr>
+          <w:rStyle w:val="NormalTok"/>
+        </w:rPr>
+        <w:t xml:space="preserve"> </w:t>
+      </w:r>
+      <w:r>
+        <w:rPr>
+          <w:rStyle w:val="DecValTok"/>
+        </w:rPr>
+        <w:t xml:space="preserve">60</w:t>
+      </w:r>
+      <w:r>
+        <w:rPr>
+          <w:rStyle w:val="OperatorTok"/>
+        </w:rPr>
+        <w:t xml:space="preserve">,</w:t>
+      </w:r>
+      <w:r>
+        <w:br/>
+      </w:r>
+      <w:r>
+        <w:rPr>
+          <w:rStyle w:val="NormalTok"/>
+        </w:rPr>
+        <w:t xml:space="preserve">  }</w:t>
+      </w:r>
+      <w:r>
+        <w:rPr>
+          <w:rStyle w:val="OperatorTok"/>
+        </w:rPr>
+        <w:t xml:space="preserve">,</w:t>
+      </w:r>
+      <w:r>
+        <w:br/>
+      </w:r>
+      <w:r>
+        <w:rPr>
+          <w:rStyle w:val="NormalTok"/>
+        </w:rPr>
+        <w:t xml:space="preserve">})</w:t>
+      </w:r>
+      <w:r>
+        <w:rPr>
+          <w:rStyle w:val="OperatorTok"/>
+        </w:rPr>
+        <w:t xml:space="preserve">;</w:t>
+      </w:r>
+      <w:r>
+        <w:br/>
+      </w:r>
+      <w:r>
+        <w:br/>
+      </w:r>
+      <w:r>
+        <w:rPr>
+          <w:rStyle w:val="KeywordTok"/>
+        </w:rPr>
+        <w:t xml:space="preserve">const</w:t>
+      </w:r>
+      <w:r>
+        <w:rPr>
+          <w:rStyle w:val="NormalTok"/>
+        </w:rPr>
+        <w:t xml:space="preserve"> issStart </w:t>
+      </w:r>
+      <w:r>
+        <w:rPr>
+          <w:rStyle w:val="OperatorTok"/>
+        </w:rPr>
+        <w:t xml:space="preserve">=</w:t>
+      </w:r>
+      <w:r>
+        <w:rPr>
+          <w:rStyle w:val="NormalTok"/>
+        </w:rPr>
+        <w:t xml:space="preserve"> iss</w:t>
+      </w:r>
+      <w:r>
+        <w:rPr>
+          <w:rStyle w:val="OperatorTok"/>
+        </w:rPr>
+        <w:t xml:space="preserve">.</w:t>
+      </w:r>
+      <w:r>
+        <w:rPr>
+          <w:rStyle w:val="AttributeTok"/>
+        </w:rPr>
+        <w:t xml:space="preserve">position</w:t>
+      </w:r>
+      <w:r>
+        <w:rPr>
+          <w:rStyle w:val="OperatorTok"/>
+        </w:rPr>
+        <w:t xml:space="preserve">.</w:t>
+      </w:r>
+      <w:r>
+        <w:rPr>
+          <w:rStyle w:val="FunctionTok"/>
+        </w:rPr>
+        <w:t xml:space="preserve">getValue</w:t>
+      </w:r>
+      <w:r>
+        <w:rPr>
+          <w:rStyle w:val="NormalTok"/>
+        </w:rPr>
+        <w:t xml:space="preserve">(start)</w:t>
+      </w:r>
+      <w:r>
+        <w:rPr>
+          <w:rStyle w:val="OperatorTok"/>
+        </w:rPr>
+        <w:t xml:space="preserve">;</w:t>
+      </w:r>
+      <w:r>
+        <w:br/>
       </w:r>
       <w:r>
         <w:rPr>
           <w:rStyle w:val="ControlFlowTok"/>
         </w:rPr>
-        <w:t xml:space="preserve">await</w:t>
-      </w:r>
-      <w:r>
-        <w:rPr>
-          <w:rStyle w:val="NormalTok"/>
-        </w:rPr>
-        <w:t xml:space="preserve"> IonResource</w:t>
+        <w:t xml:space="preserve">if</w:t>
+      </w:r>
+      <w:r>
+        <w:rPr>
+          <w:rStyle w:val="NormalTok"/>
+        </w:rPr>
+        <w:t xml:space="preserve"> (issStart) {</w:t>
+      </w:r>
+      <w:r>
+        <w:br/>
+      </w:r>
+      <w:r>
+        <w:rPr>
+          <w:rStyle w:val="NormalTok"/>
+        </w:rPr>
+        <w:t xml:space="preserve">  viewer</w:t>
       </w:r>
       <w:r>
         <w:rPr>
@@ -9451,15 +10339,72 @@
       </w:r>
       <w:r>
         <w:rPr>
+          <w:rStyle w:val="AttributeTok"/>
+        </w:rPr>
+        <w:t xml:space="preserve">camera</w:t>
+      </w:r>
+      <w:r>
+        <w:rPr>
+          <w:rStyle w:val="OperatorTok"/>
+        </w:rPr>
+        <w:t xml:space="preserve">.</w:t>
+      </w:r>
+      <w:r>
+        <w:rPr>
           <w:rStyle w:val="FunctionTok"/>
         </w:rPr>
-        <w:t xml:space="preserve">fromAssetId</w:t>
-      </w:r>
-      <w:r>
-        <w:rPr>
-          <w:rStyle w:val="NormalTok"/>
-        </w:rPr>
-        <w:t xml:space="preserve">(ISS_ION_ASSET_ID)</w:t>
+        <w:t xml:space="preserve">flyTo</w:t>
+      </w:r>
+      <w:r>
+        <w:rPr>
+          <w:rStyle w:val="NormalTok"/>
+        </w:rPr>
+        <w:t xml:space="preserve">({</w:t>
+      </w:r>
+      <w:r>
+        <w:br/>
+      </w:r>
+      <w:r>
+        <w:rPr>
+          <w:rStyle w:val="NormalTok"/>
+        </w:rPr>
+        <w:t xml:space="preserve">    </w:t>
+      </w:r>
+      <w:r>
+        <w:rPr>
+          <w:rStyle w:val="DataTypeTok"/>
+        </w:rPr>
+        <w:t xml:space="preserve">destination</w:t>
+      </w:r>
+      <w:r>
+        <w:rPr>
+          <w:rStyle w:val="OperatorTok"/>
+        </w:rPr>
+        <w:t xml:space="preserve">:</w:t>
+      </w:r>
+      <w:r>
+        <w:rPr>
+          <w:rStyle w:val="NormalTok"/>
+        </w:rPr>
+        <w:t xml:space="preserve"> Cartesian3</w:t>
+      </w:r>
+      <w:r>
+        <w:rPr>
+          <w:rStyle w:val="OperatorTok"/>
+        </w:rPr>
+        <w:t xml:space="preserve">.</w:t>
+      </w:r>
+      <w:r>
+        <w:rPr>
+          <w:rStyle w:val="FunctionTok"/>
+        </w:rPr>
+        <w:t xml:space="preserve">multiplyByScalar</w:t>
+      </w:r>
+      <w:r>
+        <w:rPr>
+          <w:rStyle w:val="NormalTok"/>
+        </w:rPr>
+        <w:t xml:space="preserve">(issStart</w:t>
       </w:r>
       <w:r>
         <w:rPr>
@@ -9468,6 +10413,60 @@
         <w:t xml:space="preserve">,</w:t>
       </w:r>
       <w:r>
+        <w:rPr>
+          <w:rStyle w:val="NormalTok"/>
+        </w:rPr>
+        <w:t xml:space="preserve"> </w:t>
+      </w:r>
+      <w:r>
+        <w:rPr>
+          <w:rStyle w:val="FloatTok"/>
+        </w:rPr>
+        <w:t xml:space="preserve">1.5</w:t>
+      </w:r>
+      <w:r>
+        <w:rPr>
+          <w:rStyle w:val="OperatorTok"/>
+        </w:rPr>
+        <w:t xml:space="preserve">,</w:t>
+      </w:r>
+      <w:r>
+        <w:rPr>
+          <w:rStyle w:val="NormalTok"/>
+        </w:rPr>
+        <w:t xml:space="preserve"> </w:t>
+      </w:r>
+      <w:r>
+        <w:rPr>
+          <w:rStyle w:val="KeywordTok"/>
+        </w:rPr>
+        <w:t xml:space="preserve">new</w:t>
+      </w:r>
+      <w:r>
+        <w:rPr>
+          <w:rStyle w:val="NormalTok"/>
+        </w:rPr>
+        <w:t xml:space="preserve"> </w:t>
+      </w:r>
+      <w:r>
+        <w:rPr>
+          <w:rStyle w:val="FunctionTok"/>
+        </w:rPr>
+        <w:t xml:space="preserve">Cartesian3</w:t>
+      </w:r>
+      <w:r>
+        <w:rPr>
+          <w:rStyle w:val="NormalTok"/>
+        </w:rPr>
+        <w:t xml:space="preserve">())</w:t>
+      </w:r>
+      <w:r>
+        <w:rPr>
+          <w:rStyle w:val="OperatorTok"/>
+        </w:rPr>
+        <w:t xml:space="preserve">,</w:t>
+      </w:r>
+      <w:r>
         <w:br/>
       </w:r>
       <w:r>
@@ -9480,7 +10479,7 @@
         <w:rPr>
           <w:rStyle w:val="DataTypeTok"/>
         </w:rPr>
-        <w:t xml:space="preserve">minimumPixelSize</w:t>
+        <w:t xml:space="preserve">duration</w:t>
       </w:r>
       <w:r>
         <w:rPr>
@@ -9496,9 +10495,9 @@
       </w:r>
       <w:r>
         <w:rPr>
-          <w:rStyle w:val="DecValTok"/>
-        </w:rPr>
-        <w:t xml:space="preserve">64</w:t>
+          <w:rStyle w:val="FloatTok"/>
+        </w:rPr>
+        <w:t xml:space="preserve">0.0</w:t>
       </w:r>
       <w:r>
         <w:rPr>
@@ -9513,457 +10512,7 @@
         <w:rPr>
           <w:rStyle w:val="NormalTok"/>
         </w:rPr>
-        <w:t xml:space="preserve">    </w:t>
-      </w:r>
-      <w:r>
-        <w:rPr>
-          <w:rStyle w:val="DataTypeTok"/>
-        </w:rPr>
-        <w:t xml:space="preserve">maximumScale</w:t>
-      </w:r>
-      <w:r>
-        <w:rPr>
-          <w:rStyle w:val="OperatorTok"/>
-        </w:rPr>
-        <w:t xml:space="preserve">:</w:t>
-      </w:r>
-      <w:r>
-        <w:rPr>
-          <w:rStyle w:val="NormalTok"/>
-        </w:rPr>
-        <w:t xml:space="preserve"> </w:t>
-      </w:r>
-      <w:r>
-        <w:rPr>
-          <w:rStyle w:val="FloatTok"/>
-        </w:rPr>
-        <w:t xml:space="preserve">20_000.0</w:t>
-      </w:r>
-      <w:r>
-        <w:rPr>
-          <w:rStyle w:val="OperatorTok"/>
-        </w:rPr>
-        <w:t xml:space="preserve">,</w:t>
-      </w:r>
-      <w:r>
-        <w:br/>
-      </w:r>
-      <w:r>
-        <w:rPr>
-          <w:rStyle w:val="NormalTok"/>
-        </w:rPr>
-        <w:t xml:space="preserve">  }</w:t>
-      </w:r>
-      <w:r>
-        <w:rPr>
-          <w:rStyle w:val="OperatorTok"/>
-        </w:rPr>
-        <w:t xml:space="preserve">,</w:t>
-      </w:r>
-      <w:r>
-        <w:br/>
-      </w:r>
-      <w:r>
-        <w:rPr>
-          <w:rStyle w:val="NormalTok"/>
-        </w:rPr>
-        <w:t xml:space="preserve">  </w:t>
-      </w:r>
-      <w:r>
-        <w:rPr>
-          <w:rStyle w:val="DataTypeTok"/>
-        </w:rPr>
-        <w:t xml:space="preserve">path</w:t>
-      </w:r>
-      <w:r>
-        <w:rPr>
-          <w:rStyle w:val="OperatorTok"/>
-        </w:rPr>
-        <w:t xml:space="preserve">:</w:t>
-      </w:r>
-      <w:r>
-        <w:rPr>
-          <w:rStyle w:val="NormalTok"/>
-        </w:rPr>
-        <w:t xml:space="preserve"> {</w:t>
-      </w:r>
-      <w:r>
-        <w:br/>
-      </w:r>
-      <w:r>
-        <w:rPr>
-          <w:rStyle w:val="NormalTok"/>
-        </w:rPr>
-        <w:t xml:space="preserve">    </w:t>
-      </w:r>
-      <w:r>
-        <w:rPr>
-          <w:rStyle w:val="DataTypeTok"/>
-        </w:rPr>
-        <w:t xml:space="preserve">resolution</w:t>
-      </w:r>
-      <w:r>
-        <w:rPr>
-          <w:rStyle w:val="OperatorTok"/>
-        </w:rPr>
-        <w:t xml:space="preserve">:</w:t>
-      </w:r>
-      <w:r>
-        <w:rPr>
-          <w:rStyle w:val="NormalTok"/>
-        </w:rPr>
-        <w:t xml:space="preserve"> </w:t>
-      </w:r>
-      <w:r>
-        <w:rPr>
-          <w:rStyle w:val="DecValTok"/>
-        </w:rPr>
-        <w:t xml:space="preserve">120</w:t>
-      </w:r>
-      <w:r>
-        <w:rPr>
-          <w:rStyle w:val="OperatorTok"/>
-        </w:rPr>
-        <w:t xml:space="preserve">,</w:t>
-      </w:r>
-      <w:r>
-        <w:br/>
-      </w:r>
-      <w:r>
-        <w:rPr>
-          <w:rStyle w:val="NormalTok"/>
-        </w:rPr>
-        <w:t xml:space="preserve">    </w:t>
-      </w:r>
-      <w:r>
-        <w:rPr>
-          <w:rStyle w:val="DataTypeTok"/>
-        </w:rPr>
-        <w:t xml:space="preserve">material</w:t>
-      </w:r>
-      <w:r>
-        <w:rPr>
-          <w:rStyle w:val="OperatorTok"/>
-        </w:rPr>
-        <w:t xml:space="preserve">:</w:t>
-      </w:r>
-      <w:r>
-        <w:rPr>
-          <w:rStyle w:val="NormalTok"/>
-        </w:rPr>
-        <w:t xml:space="preserve"> </w:t>
-      </w:r>
-      <w:r>
-        <w:rPr>
-          <w:rStyle w:val="KeywordTok"/>
-        </w:rPr>
-        <w:t xml:space="preserve">new</w:t>
-      </w:r>
-      <w:r>
-        <w:rPr>
-          <w:rStyle w:val="NormalTok"/>
-        </w:rPr>
-        <w:t xml:space="preserve"> </w:t>
-      </w:r>
-      <w:r>
-        <w:rPr>
-          <w:rStyle w:val="FunctionTok"/>
-        </w:rPr>
-        <w:t xml:space="preserve">PolylineGlowMaterialProperty</w:t>
-      </w:r>
-      <w:r>
-        <w:rPr>
-          <w:rStyle w:val="NormalTok"/>
-        </w:rPr>
-        <w:t xml:space="preserve">({</w:t>
-      </w:r>
-      <w:r>
-        <w:br/>
-      </w:r>
-      <w:r>
-        <w:rPr>
-          <w:rStyle w:val="NormalTok"/>
-        </w:rPr>
-        <w:t xml:space="preserve">      </w:t>
-      </w:r>
-      <w:r>
-        <w:rPr>
-          <w:rStyle w:val="DataTypeTok"/>
-        </w:rPr>
-        <w:t xml:space="preserve">glowPower</w:t>
-      </w:r>
-      <w:r>
-        <w:rPr>
-          <w:rStyle w:val="OperatorTok"/>
-        </w:rPr>
-        <w:t xml:space="preserve">:</w:t>
-      </w:r>
-      <w:r>
-        <w:rPr>
-          <w:rStyle w:val="NormalTok"/>
-        </w:rPr>
-        <w:t xml:space="preserve"> </w:t>
-      </w:r>
-      <w:r>
-        <w:rPr>
-          <w:rStyle w:val="FloatTok"/>
-        </w:rPr>
-        <w:t xml:space="preserve">0.2</w:t>
-      </w:r>
-      <w:r>
-        <w:rPr>
-          <w:rStyle w:val="OperatorTok"/>
-        </w:rPr>
-        <w:t xml:space="preserve">,</w:t>
-      </w:r>
-      <w:r>
-        <w:br/>
-      </w:r>
-      <w:r>
-        <w:rPr>
-          <w:rStyle w:val="NormalTok"/>
-        </w:rPr>
-        <w:t xml:space="preserve">      </w:t>
-      </w:r>
-      <w:r>
-        <w:rPr>
-          <w:rStyle w:val="DataTypeTok"/>
-        </w:rPr>
-        <w:t xml:space="preserve">color</w:t>
-      </w:r>
-      <w:r>
-        <w:rPr>
-          <w:rStyle w:val="OperatorTok"/>
-        </w:rPr>
-        <w:t xml:space="preserve">:</w:t>
-      </w:r>
-      <w:r>
-        <w:rPr>
-          <w:rStyle w:val="NormalTok"/>
-        </w:rPr>
-        <w:t xml:space="preserve"> Color</w:t>
-      </w:r>
-      <w:r>
-        <w:rPr>
-          <w:rStyle w:val="OperatorTok"/>
-        </w:rPr>
-        <w:t xml:space="preserve">.</w:t>
-      </w:r>
-      <w:r>
-        <w:rPr>
-          <w:rStyle w:val="AttributeTok"/>
-        </w:rPr>
-        <w:t xml:space="preserve">CYAN</w:t>
-      </w:r>
-      <w:r>
-        <w:rPr>
-          <w:rStyle w:val="OperatorTok"/>
-        </w:rPr>
-        <w:t xml:space="preserve">,</w:t>
-      </w:r>
-      <w:r>
-        <w:br/>
-      </w:r>
-      <w:r>
-        <w:rPr>
-          <w:rStyle w:val="NormalTok"/>
-        </w:rPr>
-        <w:t xml:space="preserve">    })</w:t>
-      </w:r>
-      <w:r>
-        <w:rPr>
-          <w:rStyle w:val="OperatorTok"/>
-        </w:rPr>
-        <w:t xml:space="preserve">,</w:t>
-      </w:r>
-      <w:r>
-        <w:br/>
-      </w:r>
-      <w:r>
-        <w:rPr>
-          <w:rStyle w:val="NormalTok"/>
-        </w:rPr>
-        <w:t xml:space="preserve">    </w:t>
-      </w:r>
-      <w:r>
-        <w:rPr>
-          <w:rStyle w:val="DataTypeTok"/>
-        </w:rPr>
-        <w:t xml:space="preserve">width</w:t>
-      </w:r>
-      <w:r>
-        <w:rPr>
-          <w:rStyle w:val="OperatorTok"/>
-        </w:rPr>
-        <w:t xml:space="preserve">:</w:t>
-      </w:r>
-      <w:r>
-        <w:rPr>
-          <w:rStyle w:val="NormalTok"/>
-        </w:rPr>
-        <w:t xml:space="preserve"> </w:t>
-      </w:r>
-      <w:r>
-        <w:rPr>
-          <w:rStyle w:val="DecValTok"/>
-        </w:rPr>
-        <w:t xml:space="preserve">8</w:t>
-      </w:r>
-      <w:r>
-        <w:rPr>
-          <w:rStyle w:val="OperatorTok"/>
-        </w:rPr>
-        <w:t xml:space="preserve">,</w:t>
-      </w:r>
-      <w:r>
-        <w:br/>
-      </w:r>
-      <w:r>
-        <w:rPr>
-          <w:rStyle w:val="NormalTok"/>
-        </w:rPr>
-        <w:t xml:space="preserve">    </w:t>
-      </w:r>
-      <w:r>
-        <w:rPr>
-          <w:rStyle w:val="DataTypeTok"/>
-        </w:rPr>
-        <w:t xml:space="preserve">leadTime</w:t>
-      </w:r>
-      <w:r>
-        <w:rPr>
-          <w:rStyle w:val="OperatorTok"/>
-        </w:rPr>
-        <w:t xml:space="preserve">:</w:t>
-      </w:r>
-      <w:r>
-        <w:rPr>
-          <w:rStyle w:val="NormalTok"/>
-        </w:rPr>
-        <w:t xml:space="preserve"> </w:t>
-      </w:r>
-      <w:r>
-        <w:rPr>
-          <w:rStyle w:val="DecValTok"/>
-        </w:rPr>
-        <w:t xml:space="preserve">93</w:t>
-      </w:r>
-      <w:r>
-        <w:rPr>
-          <w:rStyle w:val="NormalTok"/>
-        </w:rPr>
-        <w:t xml:space="preserve"> </w:t>
-      </w:r>
-      <w:r>
-        <w:rPr>
-          <w:rStyle w:val="OperatorTok"/>
-        </w:rPr>
-        <w:t xml:space="preserve">*</w:t>
-      </w:r>
-      <w:r>
-        <w:rPr>
-          <w:rStyle w:val="NormalTok"/>
-        </w:rPr>
-        <w:t xml:space="preserve"> </w:t>
-      </w:r>
-      <w:r>
-        <w:rPr>
-          <w:rStyle w:val="DecValTok"/>
-        </w:rPr>
-        <w:t xml:space="preserve">60</w:t>
-      </w:r>
-      <w:r>
-        <w:rPr>
-          <w:rStyle w:val="OperatorTok"/>
-        </w:rPr>
-        <w:t xml:space="preserve">,</w:t>
-      </w:r>
-      <w:r>
-        <w:br/>
-      </w:r>
-      <w:r>
-        <w:rPr>
-          <w:rStyle w:val="NormalTok"/>
-        </w:rPr>
-        <w:t xml:space="preserve">    </w:t>
-      </w:r>
-      <w:r>
-        <w:rPr>
-          <w:rStyle w:val="DataTypeTok"/>
-        </w:rPr>
-        <w:t xml:space="preserve">trailTime</w:t>
-      </w:r>
-      <w:r>
-        <w:rPr>
-          <w:rStyle w:val="OperatorTok"/>
-        </w:rPr>
-        <w:t xml:space="preserve">:</w:t>
-      </w:r>
-      <w:r>
-        <w:rPr>
-          <w:rStyle w:val="NormalTok"/>
-        </w:rPr>
-        <w:t xml:space="preserve"> </w:t>
-      </w:r>
-      <w:r>
-        <w:rPr>
-          <w:rStyle w:val="DecValTok"/>
-        </w:rPr>
-        <w:t xml:space="preserve">93</w:t>
-      </w:r>
-      <w:r>
-        <w:rPr>
-          <w:rStyle w:val="NormalTok"/>
-        </w:rPr>
-        <w:t xml:space="preserve"> </w:t>
-      </w:r>
-      <w:r>
-        <w:rPr>
-          <w:rStyle w:val="OperatorTok"/>
-        </w:rPr>
-        <w:t xml:space="preserve">*</w:t>
-      </w:r>
-      <w:r>
-        <w:rPr>
-          <w:rStyle w:val="NormalTok"/>
-        </w:rPr>
-        <w:t xml:space="preserve"> </w:t>
-      </w:r>
-      <w:r>
-        <w:rPr>
-          <w:rStyle w:val="DecValTok"/>
-        </w:rPr>
-        <w:t xml:space="preserve">60</w:t>
-      </w:r>
-      <w:r>
-        <w:rPr>
-          <w:rStyle w:val="OperatorTok"/>
-        </w:rPr>
-        <w:t xml:space="preserve">,</w:t>
-      </w:r>
-      <w:r>
-        <w:br/>
-      </w:r>
-      <w:r>
-        <w:rPr>
-          <w:rStyle w:val="NormalTok"/>
-        </w:rPr>
-        <w:t xml:space="preserve">  }</w:t>
-      </w:r>
-      <w:r>
-        <w:rPr>
-          <w:rStyle w:val="OperatorTok"/>
-        </w:rPr>
-        <w:t xml:space="preserve">,</w:t>
-      </w:r>
-      <w:r>
-        <w:br/>
-      </w:r>
-      <w:r>
-        <w:rPr>
-          <w:rStyle w:val="NormalTok"/>
-        </w:rPr>
-        <w:t xml:space="preserve">})</w:t>
+        <w:t xml:space="preserve">  })</w:t>
       </w:r>
       <w:r>
         <w:rPr>
@@ -9975,265 +10524,10 @@
         <w:br/>
       </w:r>
       <w:r>
-        <w:br/>
-      </w:r>
-      <w:r>
-        <w:rPr>
-          <w:rStyle w:val="KeywordTok"/>
-        </w:rPr>
-        <w:t xml:space="preserve">const</w:t>
-      </w:r>
-      <w:r>
-        <w:rPr>
-          <w:rStyle w:val="NormalTok"/>
-        </w:rPr>
-        <w:t xml:space="preserve"> issStart </w:t>
-      </w:r>
-      <w:r>
-        <w:rPr>
-          <w:rStyle w:val="OperatorTok"/>
-        </w:rPr>
-        <w:t xml:space="preserve">=</w:t>
-      </w:r>
-      <w:r>
-        <w:rPr>
-          <w:rStyle w:val="NormalTok"/>
-        </w:rPr>
-        <w:t xml:space="preserve"> iss</w:t>
-      </w:r>
-      <w:r>
-        <w:rPr>
-          <w:rStyle w:val="OperatorTok"/>
-        </w:rPr>
-        <w:t xml:space="preserve">.</w:t>
-      </w:r>
-      <w:r>
-        <w:rPr>
-          <w:rStyle w:val="AttributeTok"/>
-        </w:rPr>
-        <w:t xml:space="preserve">position</w:t>
-      </w:r>
-      <w:r>
-        <w:rPr>
-          <w:rStyle w:val="OperatorTok"/>
-        </w:rPr>
-        <w:t xml:space="preserve">.</w:t>
-      </w:r>
-      <w:r>
-        <w:rPr>
-          <w:rStyle w:val="FunctionTok"/>
-        </w:rPr>
-        <w:t xml:space="preserve">getValue</w:t>
-      </w:r>
-      <w:r>
-        <w:rPr>
-          <w:rStyle w:val="NormalTok"/>
-        </w:rPr>
-        <w:t xml:space="preserve">(start)</w:t>
-      </w:r>
-      <w:r>
-        <w:rPr>
-          <w:rStyle w:val="OperatorTok"/>
-        </w:rPr>
-        <w:t xml:space="preserve">;</w:t>
-      </w:r>
-      <w:r>
-        <w:br/>
-      </w:r>
-      <w:r>
-        <w:rPr>
-          <w:rStyle w:val="NormalTok"/>
-        </w:rPr>
-        <w:t xml:space="preserve">viewer</w:t>
-      </w:r>
-      <w:r>
-        <w:rPr>
-          <w:rStyle w:val="OperatorTok"/>
-        </w:rPr>
-        <w:t xml:space="preserve">.</w:t>
-      </w:r>
-      <w:r>
-        <w:rPr>
-          <w:rStyle w:val="AttributeTok"/>
-        </w:rPr>
-        <w:t xml:space="preserve">camera</w:t>
-      </w:r>
-      <w:r>
-        <w:rPr>
-          <w:rStyle w:val="OperatorTok"/>
-        </w:rPr>
-        <w:t xml:space="preserve">.</w:t>
-      </w:r>
-      <w:r>
-        <w:rPr>
-          <w:rStyle w:val="FunctionTok"/>
-        </w:rPr>
-        <w:t xml:space="preserve">flyTo</w:t>
-      </w:r>
-      <w:r>
-        <w:rPr>
-          <w:rStyle w:val="NormalTok"/>
-        </w:rPr>
-        <w:t xml:space="preserve">({</w:t>
-      </w:r>
-      <w:r>
-        <w:br/>
-      </w:r>
-      <w:r>
-        <w:rPr>
-          <w:rStyle w:val="NormalTok"/>
-        </w:rPr>
-        <w:t xml:space="preserve">  </w:t>
-      </w:r>
-      <w:r>
-        <w:rPr>
-          <w:rStyle w:val="DataTypeTok"/>
-        </w:rPr>
-        <w:t xml:space="preserve">destination</w:t>
-      </w:r>
-      <w:r>
-        <w:rPr>
-          <w:rStyle w:val="OperatorTok"/>
-        </w:rPr>
-        <w:t xml:space="preserve">:</w:t>
-      </w:r>
-      <w:r>
-        <w:rPr>
-          <w:rStyle w:val="NormalTok"/>
-        </w:rPr>
-        <w:t xml:space="preserve"> Cartesian3</w:t>
-      </w:r>
-      <w:r>
-        <w:rPr>
-          <w:rStyle w:val="OperatorTok"/>
-        </w:rPr>
-        <w:t xml:space="preserve">.</w:t>
-      </w:r>
-      <w:r>
-        <w:rPr>
-          <w:rStyle w:val="FunctionTok"/>
-        </w:rPr>
-        <w:t xml:space="preserve">multiplyByScalar</w:t>
-      </w:r>
-      <w:r>
-        <w:rPr>
-          <w:rStyle w:val="NormalTok"/>
-        </w:rPr>
-        <w:t xml:space="preserve">(issStart</w:t>
-      </w:r>
-      <w:r>
-        <w:rPr>
-          <w:rStyle w:val="OperatorTok"/>
-        </w:rPr>
-        <w:t xml:space="preserve">,</w:t>
-      </w:r>
-      <w:r>
-        <w:rPr>
-          <w:rStyle w:val="NormalTok"/>
-        </w:rPr>
-        <w:t xml:space="preserve"> </w:t>
-      </w:r>
-      <w:r>
-        <w:rPr>
-          <w:rStyle w:val="FloatTok"/>
-        </w:rPr>
-        <w:t xml:space="preserve">1.5</w:t>
-      </w:r>
-      <w:r>
-        <w:rPr>
-          <w:rStyle w:val="OperatorTok"/>
-        </w:rPr>
-        <w:t xml:space="preserve">,</w:t>
-      </w:r>
-      <w:r>
-        <w:rPr>
-          <w:rStyle w:val="NormalTok"/>
-        </w:rPr>
-        <w:t xml:space="preserve"> </w:t>
-      </w:r>
-      <w:r>
-        <w:rPr>
-          <w:rStyle w:val="KeywordTok"/>
-        </w:rPr>
-        <w:t xml:space="preserve">new</w:t>
-      </w:r>
-      <w:r>
-        <w:rPr>
-          <w:rStyle w:val="NormalTok"/>
-        </w:rPr>
-        <w:t xml:space="preserve"> </w:t>
-      </w:r>
-      <w:r>
-        <w:rPr>
-          <w:rStyle w:val="FunctionTok"/>
-        </w:rPr>
-        <w:t xml:space="preserve">Cartesian3</w:t>
-      </w:r>
-      <w:r>
-        <w:rPr>
-          <w:rStyle w:val="NormalTok"/>
-        </w:rPr>
-        <w:t xml:space="preserve">())</w:t>
-      </w:r>
-      <w:r>
-        <w:rPr>
-          <w:rStyle w:val="OperatorTok"/>
-        </w:rPr>
-        <w:t xml:space="preserve">,</w:t>
-      </w:r>
-      <w:r>
-        <w:br/>
-      </w:r>
-      <w:r>
-        <w:rPr>
-          <w:rStyle w:val="NormalTok"/>
-        </w:rPr>
-        <w:t xml:space="preserve">  </w:t>
-      </w:r>
-      <w:r>
-        <w:rPr>
-          <w:rStyle w:val="DataTypeTok"/>
-        </w:rPr>
-        <w:t xml:space="preserve">duration</w:t>
-      </w:r>
-      <w:r>
-        <w:rPr>
-          <w:rStyle w:val="OperatorTok"/>
-        </w:rPr>
-        <w:t xml:space="preserve">:</w:t>
-      </w:r>
-      <w:r>
-        <w:rPr>
-          <w:rStyle w:val="NormalTok"/>
-        </w:rPr>
-        <w:t xml:space="preserve"> </w:t>
-      </w:r>
-      <w:r>
-        <w:rPr>
-          <w:rStyle w:val="FloatTok"/>
-        </w:rPr>
-        <w:t xml:space="preserve">0.0</w:t>
-      </w:r>
-      <w:r>
-        <w:rPr>
-          <w:rStyle w:val="OperatorTok"/>
-        </w:rPr>
-        <w:t xml:space="preserve">,</w:t>
-      </w:r>
-      <w:r>
-        <w:br/>
-      </w:r>
-      <w:r>
-        <w:rPr>
-          <w:rStyle w:val="NormalTok"/>
-        </w:rPr>
-        <w:t xml:space="preserve">})</w:t>
-      </w:r>
-      <w:r>
-        <w:rPr>
-          <w:rStyle w:val="OperatorTok"/>
-        </w:rPr>
-        <w:t xml:space="preserve">;</w:t>
+        <w:rPr>
+          <w:rStyle w:val="NormalTok"/>
+        </w:rPr>
+        <w:t xml:space="preserve">}</w:t>
       </w:r>
       <w:r>
         <w:br/>
@@ -11998,6 +12292,25 @@
           <w:rStyle w:val="VerbatimChar"/>
         </w:rPr>
         <w:t xml:space="preserve">viewer.clock.shouldAnimate = true</w:t>
+      </w:r>
+    </w:p>
+    <w:p>
+      <w:pPr>
+        <w:pStyle w:val="Compact"/>
+        <w:numPr>
+          <w:ilvl w:val="0"/>
+          <w:numId w:val="1006"/>
+        </w:numPr>
+      </w:pPr>
+      <w:r>
+        <w:rPr>
+          <w:b/>
+          <w:bCs/>
+        </w:rPr>
+        <w:t xml:space="preserve">Sketchfab download blocked</w:t>
+      </w:r>
+      <w:r>
+        <w:t xml:space="preserve">: Complete login/CAPTCHA manually in your browser, or use any local glTF folder temporarily to finish ion upload + app wiring</w:t>
       </w:r>
     </w:p>
     <w:p>

</xml_diff>